<commit_message>
mentions visuals in proposal
</commit_message>
<xml_diff>
--- a/project_proposal.docx
+++ b/project_proposal.docx
@@ -138,35 +138,7 @@
           <w:sz w:val="22"/>
           <w:szCs w:val="22"/>
         </w:rPr>
-        <w:t xml:space="preserve">Colin Holm – </w:t>
-      </w:r>
-      <w:r>
-        <w:rPr>
-          <w:sz w:val="22"/>
-          <w:szCs w:val="22"/>
-        </w:rPr>
-        <w:t>Additional</w:t>
-      </w:r>
-      <w:r>
-        <w:rPr>
-          <w:sz w:val="22"/>
-          <w:szCs w:val="22"/>
-        </w:rPr>
-        <w:t xml:space="preserve"> Data Engineer</w:t>
-      </w:r>
-      <w:r>
-        <w:rPr>
-          <w:sz w:val="22"/>
-          <w:szCs w:val="22"/>
-        </w:rPr>
-        <w:t>/</w:t>
-      </w:r>
-      <w:r>
-        <w:rPr>
-          <w:sz w:val="22"/>
-          <w:szCs w:val="22"/>
-        </w:rPr>
-        <w:t>Text Mining Analyst</w:t>
+        <w:t>Colin Holm – Additional Data Engineer/Text Mining Analyst</w:t>
       </w:r>
     </w:p>
     <w:p>
@@ -370,6 +342,7 @@
       </w:pPr>
       <w:r>
         <w:rPr>
+          <w:noProof/>
           <w:sz w:val="22"/>
           <w:szCs w:val="22"/>
         </w:rPr>
@@ -459,6 +432,7 @@
       </w:pPr>
       <w:r>
         <w:rPr>
+          <w:noProof/>
           <w:sz w:val="22"/>
           <w:szCs w:val="22"/>
         </w:rPr>
@@ -591,7 +565,37 @@
           <w:sz w:val="22"/>
           <w:szCs w:val="22"/>
         </w:rPr>
-        <w:t xml:space="preserve"> on the article bodies from the dataset in document-term matrix format, cleaned and labeled. Additionally, we intend to perform a comparison of word and n-gram frequencies between the two corpuses, identifying what terms are most prevalent in fake articles. Finally, we will join this dataset with a sentiment dictionary so that we can contrast the mood and tone of each type of article, gaining insight into what emotions the authors of fake articles use to spread their content. </w:t>
+        <w:t xml:space="preserve"> on the article bodies from the dataset in document-term matrix format, cleaned and labeled. Additionally, we intend to perform a comparison of word and n-gram frequencies between the two corpuses, identifying what terms are most prevalent in fake articles. </w:t>
+      </w:r>
+      <w:r>
+        <w:rPr>
+          <w:sz w:val="22"/>
+          <w:szCs w:val="22"/>
+        </w:rPr>
+        <w:t xml:space="preserve">We will prepare a </w:t>
+      </w:r>
+      <w:proofErr w:type="spellStart"/>
+      <w:r>
+        <w:rPr>
+          <w:sz w:val="22"/>
+          <w:szCs w:val="22"/>
+        </w:rPr>
+        <w:t>wordcloud</w:t>
+      </w:r>
+      <w:proofErr w:type="spellEnd"/>
+      <w:r>
+        <w:rPr>
+          <w:sz w:val="22"/>
+          <w:szCs w:val="22"/>
+        </w:rPr>
+        <w:t xml:space="preserve"> or frequency chart visual using ggplot2 packages to further this. </w:t>
+      </w:r>
+      <w:r>
+        <w:rPr>
+          <w:sz w:val="22"/>
+          <w:szCs w:val="22"/>
+        </w:rPr>
+        <w:t xml:space="preserve">Finally, we will join this dataset with a sentiment dictionary so that we can contrast the mood and tone of each type of article, gaining insight into what emotions the authors of fake articles use to spread their content. </w:t>
       </w:r>
     </w:p>
     <w:p>
@@ -629,13 +633,14 @@
       </w:pPr>
       <w:r>
         <w:rPr>
+          <w:noProof/>
           <w:sz w:val="22"/>
           <w:szCs w:val="22"/>
         </w:rPr>
         <w:drawing>
-          <wp:inline distT="0" distB="0" distL="0" distR="0" wp14:anchorId="11F27316" wp14:editId="40E4E9F9">
-            <wp:extent cx="3228975" cy="1589649"/>
-            <wp:effectExtent l="19050" t="19050" r="9525" b="10795"/>
+          <wp:inline distT="0" distB="0" distL="0" distR="0" wp14:anchorId="11F27316" wp14:editId="55241583">
+            <wp:extent cx="3041650" cy="1497428"/>
+            <wp:effectExtent l="19050" t="19050" r="25400" b="26670"/>
             <wp:docPr id="362714598" name="Picture 1"/>
             <wp:cNvGraphicFramePr>
               <a:graphicFrameLocks xmlns:a="http://schemas.openxmlformats.org/drawingml/2006/main" noChangeAspect="1"/>
@@ -656,7 +661,7 @@
                   <pic:spPr>
                     <a:xfrm>
                       <a:off x="0" y="0"/>
-                      <a:ext cx="3253955" cy="1601947"/>
+                      <a:ext cx="3073358" cy="1513038"/>
                     </a:xfrm>
                     <a:prstGeom prst="rect">
                       <a:avLst/>
@@ -706,13 +711,14 @@
       </w:pPr>
       <w:r>
         <w:rPr>
+          <w:noProof/>
           <w:sz w:val="22"/>
           <w:szCs w:val="22"/>
         </w:rPr>
         <w:drawing>
-          <wp:inline distT="0" distB="0" distL="0" distR="0" wp14:anchorId="02B2F706" wp14:editId="62B90644">
-            <wp:extent cx="3235325" cy="1485622"/>
-            <wp:effectExtent l="19050" t="19050" r="22225" b="19685"/>
+          <wp:inline distT="0" distB="0" distL="0" distR="0" wp14:anchorId="02B2F706" wp14:editId="4A8B77B6">
+            <wp:extent cx="3057525" cy="1403978"/>
+            <wp:effectExtent l="19050" t="19050" r="9525" b="25400"/>
             <wp:docPr id="2077276968" name="Picture 1" descr="A screenshot of a computer code&#10;&#10;AI-generated content may be incorrect."/>
             <wp:cNvGraphicFramePr>
               <a:graphicFrameLocks xmlns:a="http://schemas.openxmlformats.org/drawingml/2006/main" noChangeAspect="1"/>
@@ -733,7 +739,7 @@
                   <pic:spPr>
                     <a:xfrm>
                       <a:off x="0" y="0"/>
-                      <a:ext cx="3265141" cy="1499313"/>
+                      <a:ext cx="3098551" cy="1422816"/>
                     </a:xfrm>
                     <a:prstGeom prst="rect">
                       <a:avLst/>

</xml_diff>